<commit_message>
Added municipality details page
</commit_message>
<xml_diff>
--- a/docs/Documentation.docx
+++ b/docs/Documentation.docx
@@ -331,6 +331,88 @@
           <w:sz w:val="21"/>
           <w:szCs w:val="21"/>
         </w:rPr>
+        <w:t>Municipality details page:</w:t>
+      </w:r>
+    </w:p>
+    <w:p>
+      <w:pPr>
+        <w:rPr>
+          <w:b/>
+          <w:bCs/>
+          <w:sz w:val="21"/>
+          <w:szCs w:val="21"/>
+        </w:rPr>
+      </w:pPr>
+      <w:r>
+        <w:rPr>
+          <w:noProof/>
+        </w:rPr>
+        <w:drawing>
+          <wp:inline distT="0" distB="0" distL="0" distR="0" wp14:anchorId="74DFBD57" wp14:editId="2205BA20">
+            <wp:extent cx="5943600" cy="4142740"/>
+            <wp:effectExtent l="0" t="0" r="0" b="0"/>
+            <wp:docPr id="1952900974" name="Picture 1"/>
+            <wp:cNvGraphicFramePr>
+              <a:graphicFrameLocks xmlns:a="http://schemas.openxmlformats.org/drawingml/2006/main" noChangeAspect="1"/>
+            </wp:cNvGraphicFramePr>
+            <a:graphic xmlns:a="http://schemas.openxmlformats.org/drawingml/2006/main">
+              <a:graphicData uri="http://schemas.openxmlformats.org/drawingml/2006/picture">
+                <pic:pic xmlns:pic="http://schemas.openxmlformats.org/drawingml/2006/picture">
+                  <pic:nvPicPr>
+                    <pic:cNvPr id="1952900974" name=""/>
+                    <pic:cNvPicPr/>
+                  </pic:nvPicPr>
+                  <pic:blipFill>
+                    <a:blip r:embed="rId7"/>
+                    <a:stretch>
+                      <a:fillRect/>
+                    </a:stretch>
+                  </pic:blipFill>
+                  <pic:spPr>
+                    <a:xfrm>
+                      <a:off x="0" y="0"/>
+                      <a:ext cx="5943600" cy="4142740"/>
+                    </a:xfrm>
+                    <a:prstGeom prst="rect">
+                      <a:avLst/>
+                    </a:prstGeom>
+                  </pic:spPr>
+                </pic:pic>
+              </a:graphicData>
+            </a:graphic>
+          </wp:inline>
+        </w:drawing>
+      </w:r>
+    </w:p>
+    <w:p>
+      <w:pPr>
+        <w:rPr>
+          <w:sz w:val="21"/>
+          <w:szCs w:val="21"/>
+        </w:rPr>
+      </w:pPr>
+    </w:p>
+    <w:p>
+      <w:pPr>
+        <w:rPr>
+          <w:sz w:val="21"/>
+          <w:szCs w:val="21"/>
+        </w:rPr>
+      </w:pPr>
+    </w:p>
+    <w:p>
+      <w:pPr>
+        <w:rPr>
+          <w:sz w:val="21"/>
+          <w:szCs w:val="21"/>
+        </w:rPr>
+      </w:pPr>
+      <w:r>
+        <w:rPr>
+          <w:sz w:val="21"/>
+          <w:szCs w:val="21"/>
+        </w:rPr>
+        <w:lastRenderedPageBreak/>
         <w:t>Candidate browser:</w:t>
       </w:r>
     </w:p>
@@ -361,7 +443,7 @@
                     <pic:cNvPicPr/>
                   </pic:nvPicPr>
                   <pic:blipFill>
-                    <a:blip r:embed="rId7"/>
+                    <a:blip r:embed="rId8"/>
                     <a:stretch>
                       <a:fillRect/>
                     </a:stretch>
@@ -426,7 +508,6 @@
           <w:sz w:val="21"/>
           <w:szCs w:val="21"/>
         </w:rPr>
-        <w:lastRenderedPageBreak/>
         <w:t>Candidate profile (accessed by clicking view profile)</w:t>
       </w:r>
     </w:p>
@@ -442,8 +523,8 @@
           <w:noProof/>
         </w:rPr>
         <w:drawing>
-          <wp:inline distT="0" distB="0" distL="0" distR="0" wp14:anchorId="2D26D2D1" wp14:editId="79F77E6A">
-            <wp:extent cx="5943600" cy="3239135"/>
+          <wp:inline distT="0" distB="0" distL="0" distR="0" wp14:anchorId="2D26D2D1" wp14:editId="7414DC2A">
+            <wp:extent cx="5223539" cy="2846717"/>
             <wp:effectExtent l="0" t="0" r="0" b="0"/>
             <wp:docPr id="7558870" name="Picture 1"/>
             <wp:cNvGraphicFramePr>
@@ -457,7 +538,7 @@
                     <pic:cNvPicPr/>
                   </pic:nvPicPr>
                   <pic:blipFill>
-                    <a:blip r:embed="rId8"/>
+                    <a:blip r:embed="rId9"/>
                     <a:stretch>
                       <a:fillRect/>
                     </a:stretch>
@@ -465,7 +546,7 @@
                   <pic:spPr>
                     <a:xfrm>
                       <a:off x="0" y="0"/>
-                      <a:ext cx="5943600" cy="3239135"/>
+                      <a:ext cx="5223994" cy="2846965"/>
                     </a:xfrm>
                     <a:prstGeom prst="rect">
                       <a:avLst/>
@@ -528,7 +609,7 @@
                     <pic:cNvPicPr/>
                   </pic:nvPicPr>
                   <pic:blipFill>
-                    <a:blip r:embed="rId9"/>
+                    <a:blip r:embed="rId10"/>
                     <a:stretch>
                       <a:fillRect/>
                     </a:stretch>
@@ -547,6 +628,658 @@
             </a:graphic>
           </wp:inline>
         </w:drawing>
+      </w:r>
+    </w:p>
+    <w:p>
+      <w:pPr>
+        <w:rPr>
+          <w:sz w:val="21"/>
+          <w:szCs w:val="21"/>
+        </w:rPr>
+      </w:pPr>
+    </w:p>
+    <w:p>
+      <w:pPr>
+        <w:rPr>
+          <w:sz w:val="21"/>
+          <w:szCs w:val="21"/>
+        </w:rPr>
+      </w:pPr>
+    </w:p>
+    <w:p>
+      <w:pPr>
+        <w:rPr>
+          <w:sz w:val="21"/>
+          <w:szCs w:val="21"/>
+        </w:rPr>
+      </w:pPr>
+    </w:p>
+    <w:p>
+      <w:pPr>
+        <w:rPr>
+          <w:sz w:val="21"/>
+          <w:szCs w:val="21"/>
+        </w:rPr>
+      </w:pPr>
+      <w:r>
+        <w:rPr>
+          <w:sz w:val="21"/>
+          <w:szCs w:val="21"/>
+        </w:rPr>
+        <w:t>Ballot builder page:</w:t>
+      </w:r>
+    </w:p>
+    <w:p>
+      <w:pPr>
+        <w:rPr>
+          <w:sz w:val="21"/>
+          <w:szCs w:val="21"/>
+        </w:rPr>
+      </w:pPr>
+      <w:r>
+        <w:rPr>
+          <w:noProof/>
+        </w:rPr>
+        <w:drawing>
+          <wp:inline distT="0" distB="0" distL="0" distR="0" wp14:anchorId="03FC4C23" wp14:editId="2F53FD18">
+            <wp:extent cx="5943600" cy="2603500"/>
+            <wp:effectExtent l="0" t="0" r="0" b="6350"/>
+            <wp:docPr id="313981996" name="Picture 1"/>
+            <wp:cNvGraphicFramePr>
+              <a:graphicFrameLocks xmlns:a="http://schemas.openxmlformats.org/drawingml/2006/main" noChangeAspect="1"/>
+            </wp:cNvGraphicFramePr>
+            <a:graphic xmlns:a="http://schemas.openxmlformats.org/drawingml/2006/main">
+              <a:graphicData uri="http://schemas.openxmlformats.org/drawingml/2006/picture">
+                <pic:pic xmlns:pic="http://schemas.openxmlformats.org/drawingml/2006/picture">
+                  <pic:nvPicPr>
+                    <pic:cNvPr id="313981996" name=""/>
+                    <pic:cNvPicPr/>
+                  </pic:nvPicPr>
+                  <pic:blipFill>
+                    <a:blip r:embed="rId11"/>
+                    <a:stretch>
+                      <a:fillRect/>
+                    </a:stretch>
+                  </pic:blipFill>
+                  <pic:spPr>
+                    <a:xfrm>
+                      <a:off x="0" y="0"/>
+                      <a:ext cx="5943600" cy="2603500"/>
+                    </a:xfrm>
+                    <a:prstGeom prst="rect">
+                      <a:avLst/>
+                    </a:prstGeom>
+                  </pic:spPr>
+                </pic:pic>
+              </a:graphicData>
+            </a:graphic>
+          </wp:inline>
+        </w:drawing>
+      </w:r>
+    </w:p>
+    <w:p>
+      <w:pPr>
+        <w:rPr>
+          <w:sz w:val="21"/>
+          <w:szCs w:val="21"/>
+        </w:rPr>
+      </w:pPr>
+    </w:p>
+    <w:p>
+      <w:pPr>
+        <w:rPr>
+          <w:sz w:val="21"/>
+          <w:szCs w:val="21"/>
+        </w:rPr>
+      </w:pPr>
+    </w:p>
+    <w:p>
+      <w:pPr>
+        <w:rPr>
+          <w:sz w:val="21"/>
+          <w:szCs w:val="21"/>
+        </w:rPr>
+      </w:pPr>
+      <w:r>
+        <w:rPr>
+          <w:sz w:val="21"/>
+          <w:szCs w:val="21"/>
+        </w:rPr>
+        <w:lastRenderedPageBreak/>
+        <w:t>Admin login page:</w:t>
+      </w:r>
+    </w:p>
+    <w:p>
+      <w:pPr>
+        <w:rPr>
+          <w:sz w:val="21"/>
+          <w:szCs w:val="21"/>
+        </w:rPr>
+      </w:pPr>
+      <w:r>
+        <w:rPr>
+          <w:noProof/>
+        </w:rPr>
+        <w:drawing>
+          <wp:inline distT="0" distB="0" distL="0" distR="0" wp14:anchorId="346A33C9" wp14:editId="592E84E4">
+            <wp:extent cx="5943600" cy="3338195"/>
+            <wp:effectExtent l="0" t="0" r="0" b="0"/>
+            <wp:docPr id="1135882040" name="Picture 1"/>
+            <wp:cNvGraphicFramePr>
+              <a:graphicFrameLocks xmlns:a="http://schemas.openxmlformats.org/drawingml/2006/main" noChangeAspect="1"/>
+            </wp:cNvGraphicFramePr>
+            <a:graphic xmlns:a="http://schemas.openxmlformats.org/drawingml/2006/main">
+              <a:graphicData uri="http://schemas.openxmlformats.org/drawingml/2006/picture">
+                <pic:pic xmlns:pic="http://schemas.openxmlformats.org/drawingml/2006/picture">
+                  <pic:nvPicPr>
+                    <pic:cNvPr id="1135882040" name=""/>
+                    <pic:cNvPicPr/>
+                  </pic:nvPicPr>
+                  <pic:blipFill>
+                    <a:blip r:embed="rId12"/>
+                    <a:stretch>
+                      <a:fillRect/>
+                    </a:stretch>
+                  </pic:blipFill>
+                  <pic:spPr>
+                    <a:xfrm>
+                      <a:off x="0" y="0"/>
+                      <a:ext cx="5943600" cy="3338195"/>
+                    </a:xfrm>
+                    <a:prstGeom prst="rect">
+                      <a:avLst/>
+                    </a:prstGeom>
+                  </pic:spPr>
+                </pic:pic>
+              </a:graphicData>
+            </a:graphic>
+          </wp:inline>
+        </w:drawing>
+      </w:r>
+    </w:p>
+    <w:p>
+      <w:pPr>
+        <w:rPr>
+          <w:sz w:val="21"/>
+          <w:szCs w:val="21"/>
+        </w:rPr>
+      </w:pPr>
+    </w:p>
+    <w:p>
+      <w:pPr>
+        <w:rPr>
+          <w:sz w:val="21"/>
+          <w:szCs w:val="21"/>
+        </w:rPr>
+      </w:pPr>
+      <w:r>
+        <w:rPr>
+          <w:sz w:val="21"/>
+          <w:szCs w:val="21"/>
+        </w:rPr>
+        <w:t>Admin dashboard</w:t>
+      </w:r>
+      <w:r>
+        <w:rPr>
+          <w:sz w:val="21"/>
+          <w:szCs w:val="21"/>
+        </w:rPr>
+        <w:t xml:space="preserve"> as super admin:</w:t>
+      </w:r>
+    </w:p>
+    <w:p>
+      <w:pPr>
+        <w:rPr>
+          <w:sz w:val="21"/>
+          <w:szCs w:val="21"/>
+        </w:rPr>
+      </w:pPr>
+      <w:r>
+        <w:rPr>
+          <w:noProof/>
+        </w:rPr>
+        <w:drawing>
+          <wp:inline distT="0" distB="0" distL="0" distR="0" wp14:anchorId="6DFA713F" wp14:editId="468B1FA6">
+            <wp:extent cx="5644622" cy="3683479"/>
+            <wp:effectExtent l="0" t="0" r="0" b="0"/>
+            <wp:docPr id="931376274" name="Picture 1"/>
+            <wp:cNvGraphicFramePr>
+              <a:graphicFrameLocks xmlns:a="http://schemas.openxmlformats.org/drawingml/2006/main" noChangeAspect="1"/>
+            </wp:cNvGraphicFramePr>
+            <a:graphic xmlns:a="http://schemas.openxmlformats.org/drawingml/2006/main">
+              <a:graphicData uri="http://schemas.openxmlformats.org/drawingml/2006/picture">
+                <pic:pic xmlns:pic="http://schemas.openxmlformats.org/drawingml/2006/picture">
+                  <pic:nvPicPr>
+                    <pic:cNvPr id="931376274" name=""/>
+                    <pic:cNvPicPr/>
+                  </pic:nvPicPr>
+                  <pic:blipFill>
+                    <a:blip r:embed="rId13"/>
+                    <a:stretch>
+                      <a:fillRect/>
+                    </a:stretch>
+                  </pic:blipFill>
+                  <pic:spPr>
+                    <a:xfrm>
+                      <a:off x="0" y="0"/>
+                      <a:ext cx="5660189" cy="3693637"/>
+                    </a:xfrm>
+                    <a:prstGeom prst="rect">
+                      <a:avLst/>
+                    </a:prstGeom>
+                  </pic:spPr>
+                </pic:pic>
+              </a:graphicData>
+            </a:graphic>
+          </wp:inline>
+        </w:drawing>
+      </w:r>
+    </w:p>
+    <w:p>
+      <w:pPr>
+        <w:rPr>
+          <w:sz w:val="21"/>
+          <w:szCs w:val="21"/>
+        </w:rPr>
+      </w:pPr>
+      <w:r>
+        <w:rPr>
+          <w:sz w:val="21"/>
+          <w:szCs w:val="21"/>
+        </w:rPr>
+        <w:lastRenderedPageBreak/>
+        <w:t>Admin dashboard as municipality admin (no municipalities and only candidates in respective municipality):</w:t>
+      </w:r>
+    </w:p>
+    <w:p>
+      <w:pPr>
+        <w:rPr>
+          <w:sz w:val="21"/>
+          <w:szCs w:val="21"/>
+        </w:rPr>
+      </w:pPr>
+      <w:r>
+        <w:rPr>
+          <w:noProof/>
+        </w:rPr>
+        <w:drawing>
+          <wp:inline distT="0" distB="0" distL="0" distR="0" wp14:anchorId="059466DC" wp14:editId="4C2F01AB">
+            <wp:extent cx="4782296" cy="3191774"/>
+            <wp:effectExtent l="0" t="0" r="0" b="8890"/>
+            <wp:docPr id="1852793541" name="Picture 1"/>
+            <wp:cNvGraphicFramePr>
+              <a:graphicFrameLocks xmlns:a="http://schemas.openxmlformats.org/drawingml/2006/main" noChangeAspect="1"/>
+            </wp:cNvGraphicFramePr>
+            <a:graphic xmlns:a="http://schemas.openxmlformats.org/drawingml/2006/main">
+              <a:graphicData uri="http://schemas.openxmlformats.org/drawingml/2006/picture">
+                <pic:pic xmlns:pic="http://schemas.openxmlformats.org/drawingml/2006/picture">
+                  <pic:nvPicPr>
+                    <pic:cNvPr id="1852793541" name=""/>
+                    <pic:cNvPicPr/>
+                  </pic:nvPicPr>
+                  <pic:blipFill>
+                    <a:blip r:embed="rId14"/>
+                    <a:stretch>
+                      <a:fillRect/>
+                    </a:stretch>
+                  </pic:blipFill>
+                  <pic:spPr>
+                    <a:xfrm>
+                      <a:off x="0" y="0"/>
+                      <a:ext cx="4789151" cy="3196349"/>
+                    </a:xfrm>
+                    <a:prstGeom prst="rect">
+                      <a:avLst/>
+                    </a:prstGeom>
+                  </pic:spPr>
+                </pic:pic>
+              </a:graphicData>
+            </a:graphic>
+          </wp:inline>
+        </w:drawing>
+      </w:r>
+    </w:p>
+    <w:p>
+      <w:pPr>
+        <w:rPr>
+          <w:sz w:val="21"/>
+          <w:szCs w:val="21"/>
+        </w:rPr>
+      </w:pPr>
+    </w:p>
+    <w:p>
+      <w:pPr>
+        <w:rPr>
+          <w:sz w:val="21"/>
+          <w:szCs w:val="21"/>
+        </w:rPr>
+      </w:pPr>
+      <w:r>
+        <w:rPr>
+          <w:sz w:val="21"/>
+          <w:szCs w:val="21"/>
+        </w:rPr>
+        <w:t xml:space="preserve">Add municipality </w:t>
+      </w:r>
+      <w:r>
+        <w:rPr>
+          <w:sz w:val="21"/>
+          <w:szCs w:val="21"/>
+        </w:rPr>
+        <w:t xml:space="preserve">and candidate </w:t>
+      </w:r>
+      <w:r>
+        <w:rPr>
+          <w:sz w:val="21"/>
+          <w:szCs w:val="21"/>
+        </w:rPr>
+        <w:t>page</w:t>
+      </w:r>
+      <w:r>
+        <w:rPr>
+          <w:sz w:val="21"/>
+          <w:szCs w:val="21"/>
+        </w:rPr>
+        <w:t>s:</w:t>
+      </w:r>
+    </w:p>
+    <w:p>
+      <w:pPr>
+        <w:rPr>
+          <w:sz w:val="21"/>
+          <w:szCs w:val="21"/>
+        </w:rPr>
+      </w:pPr>
+      <w:r>
+        <w:rPr>
+          <w:noProof/>
+        </w:rPr>
+        <w:drawing>
+          <wp:inline distT="0" distB="0" distL="0" distR="0" wp14:anchorId="43328644" wp14:editId="4FF6AC16">
+            <wp:extent cx="5365630" cy="3264664"/>
+            <wp:effectExtent l="0" t="0" r="6985" b="0"/>
+            <wp:docPr id="1431510565" name="Picture 1"/>
+            <wp:cNvGraphicFramePr>
+              <a:graphicFrameLocks xmlns:a="http://schemas.openxmlformats.org/drawingml/2006/main" noChangeAspect="1"/>
+            </wp:cNvGraphicFramePr>
+            <a:graphic xmlns:a="http://schemas.openxmlformats.org/drawingml/2006/main">
+              <a:graphicData uri="http://schemas.openxmlformats.org/drawingml/2006/picture">
+                <pic:pic xmlns:pic="http://schemas.openxmlformats.org/drawingml/2006/picture">
+                  <pic:nvPicPr>
+                    <pic:cNvPr id="1431510565" name=""/>
+                    <pic:cNvPicPr/>
+                  </pic:nvPicPr>
+                  <pic:blipFill>
+                    <a:blip r:embed="rId15"/>
+                    <a:stretch>
+                      <a:fillRect/>
+                    </a:stretch>
+                  </pic:blipFill>
+                  <pic:spPr>
+                    <a:xfrm>
+                      <a:off x="0" y="0"/>
+                      <a:ext cx="5368526" cy="3266426"/>
+                    </a:xfrm>
+                    <a:prstGeom prst="rect">
+                      <a:avLst/>
+                    </a:prstGeom>
+                  </pic:spPr>
+                </pic:pic>
+              </a:graphicData>
+            </a:graphic>
+          </wp:inline>
+        </w:drawing>
+      </w:r>
+    </w:p>
+    <w:p>
+      <w:pPr>
+        <w:rPr>
+          <w:sz w:val="21"/>
+          <w:szCs w:val="21"/>
+        </w:rPr>
+      </w:pPr>
+      <w:r>
+        <w:rPr>
+          <w:noProof/>
+        </w:rPr>
+        <w:lastRenderedPageBreak/>
+        <w:drawing>
+          <wp:inline distT="0" distB="0" distL="0" distR="0" wp14:anchorId="530E55ED" wp14:editId="6F05400D">
+            <wp:extent cx="5943600" cy="3674745"/>
+            <wp:effectExtent l="0" t="0" r="0" b="1905"/>
+            <wp:docPr id="1780670517" name="Picture 1"/>
+            <wp:cNvGraphicFramePr>
+              <a:graphicFrameLocks xmlns:a="http://schemas.openxmlformats.org/drawingml/2006/main" noChangeAspect="1"/>
+            </wp:cNvGraphicFramePr>
+            <a:graphic xmlns:a="http://schemas.openxmlformats.org/drawingml/2006/main">
+              <a:graphicData uri="http://schemas.openxmlformats.org/drawingml/2006/picture">
+                <pic:pic xmlns:pic="http://schemas.openxmlformats.org/drawingml/2006/picture">
+                  <pic:nvPicPr>
+                    <pic:cNvPr id="1780670517" name=""/>
+                    <pic:cNvPicPr/>
+                  </pic:nvPicPr>
+                  <pic:blipFill>
+                    <a:blip r:embed="rId16"/>
+                    <a:stretch>
+                      <a:fillRect/>
+                    </a:stretch>
+                  </pic:blipFill>
+                  <pic:spPr>
+                    <a:xfrm>
+                      <a:off x="0" y="0"/>
+                      <a:ext cx="5943600" cy="3674745"/>
+                    </a:xfrm>
+                    <a:prstGeom prst="rect">
+                      <a:avLst/>
+                    </a:prstGeom>
+                  </pic:spPr>
+                </pic:pic>
+              </a:graphicData>
+            </a:graphic>
+          </wp:inline>
+        </w:drawing>
+      </w:r>
+    </w:p>
+    <w:p>
+      <w:pPr>
+        <w:rPr>
+          <w:sz w:val="21"/>
+          <w:szCs w:val="21"/>
+        </w:rPr>
+      </w:pPr>
+    </w:p>
+    <w:p>
+      <w:pPr>
+        <w:rPr>
+          <w:sz w:val="21"/>
+          <w:szCs w:val="21"/>
+        </w:rPr>
+      </w:pPr>
+    </w:p>
+    <w:p>
+      <w:pPr>
+        <w:rPr>
+          <w:sz w:val="21"/>
+          <w:szCs w:val="21"/>
+        </w:rPr>
+      </w:pPr>
+      <w:r>
+        <w:rPr>
+          <w:sz w:val="21"/>
+          <w:szCs w:val="21"/>
+        </w:rPr>
+        <w:t>Edit municipality:</w:t>
+      </w:r>
+    </w:p>
+    <w:p>
+      <w:pPr>
+        <w:rPr>
+          <w:sz w:val="21"/>
+          <w:szCs w:val="21"/>
+        </w:rPr>
+      </w:pPr>
+      <w:r>
+        <w:rPr>
+          <w:noProof/>
+        </w:rPr>
+        <w:drawing>
+          <wp:inline distT="0" distB="0" distL="0" distR="0" wp14:anchorId="50A6E7EA" wp14:editId="02213C9E">
+            <wp:extent cx="3464058" cy="3407434"/>
+            <wp:effectExtent l="0" t="0" r="3175" b="2540"/>
+            <wp:docPr id="681514984" name="Picture 1"/>
+            <wp:cNvGraphicFramePr>
+              <a:graphicFrameLocks xmlns:a="http://schemas.openxmlformats.org/drawingml/2006/main" noChangeAspect="1"/>
+            </wp:cNvGraphicFramePr>
+            <a:graphic xmlns:a="http://schemas.openxmlformats.org/drawingml/2006/main">
+              <a:graphicData uri="http://schemas.openxmlformats.org/drawingml/2006/picture">
+                <pic:pic xmlns:pic="http://schemas.openxmlformats.org/drawingml/2006/picture">
+                  <pic:nvPicPr>
+                    <pic:cNvPr id="681514984" name=""/>
+                    <pic:cNvPicPr/>
+                  </pic:nvPicPr>
+                  <pic:blipFill>
+                    <a:blip r:embed="rId17"/>
+                    <a:stretch>
+                      <a:fillRect/>
+                    </a:stretch>
+                  </pic:blipFill>
+                  <pic:spPr>
+                    <a:xfrm>
+                      <a:off x="0" y="0"/>
+                      <a:ext cx="3465567" cy="3408918"/>
+                    </a:xfrm>
+                    <a:prstGeom prst="rect">
+                      <a:avLst/>
+                    </a:prstGeom>
+                  </pic:spPr>
+                </pic:pic>
+              </a:graphicData>
+            </a:graphic>
+          </wp:inline>
+        </w:drawing>
+      </w:r>
+    </w:p>
+    <w:p>
+      <w:pPr>
+        <w:rPr>
+          <w:sz w:val="21"/>
+          <w:szCs w:val="21"/>
+        </w:rPr>
+      </w:pPr>
+      <w:proofErr w:type="gramStart"/>
+      <w:r>
+        <w:rPr>
+          <w:sz w:val="21"/>
+          <w:szCs w:val="21"/>
+        </w:rPr>
+        <w:lastRenderedPageBreak/>
+        <w:t>Edit</w:t>
+      </w:r>
+      <w:proofErr w:type="gramEnd"/>
+      <w:r>
+        <w:rPr>
+          <w:sz w:val="21"/>
+          <w:szCs w:val="21"/>
+        </w:rPr>
+        <w:t xml:space="preserve"> candidate:</w:t>
+      </w:r>
+    </w:p>
+    <w:p>
+      <w:pPr>
+        <w:rPr>
+          <w:sz w:val="21"/>
+          <w:szCs w:val="21"/>
+        </w:rPr>
+      </w:pPr>
+      <w:r>
+        <w:rPr>
+          <w:noProof/>
+        </w:rPr>
+        <w:drawing>
+          <wp:inline distT="0" distB="0" distL="0" distR="0" wp14:anchorId="345ED816" wp14:editId="7EBD554D">
+            <wp:extent cx="4356340" cy="3599100"/>
+            <wp:effectExtent l="0" t="0" r="6350" b="1905"/>
+            <wp:docPr id="117931892" name="Picture 1"/>
+            <wp:cNvGraphicFramePr>
+              <a:graphicFrameLocks xmlns:a="http://schemas.openxmlformats.org/drawingml/2006/main" noChangeAspect="1"/>
+            </wp:cNvGraphicFramePr>
+            <a:graphic xmlns:a="http://schemas.openxmlformats.org/drawingml/2006/main">
+              <a:graphicData uri="http://schemas.openxmlformats.org/drawingml/2006/picture">
+                <pic:pic xmlns:pic="http://schemas.openxmlformats.org/drawingml/2006/picture">
+                  <pic:nvPicPr>
+                    <pic:cNvPr id="117931892" name=""/>
+                    <pic:cNvPicPr/>
+                  </pic:nvPicPr>
+                  <pic:blipFill>
+                    <a:blip r:embed="rId18"/>
+                    <a:stretch>
+                      <a:fillRect/>
+                    </a:stretch>
+                  </pic:blipFill>
+                  <pic:spPr>
+                    <a:xfrm>
+                      <a:off x="0" y="0"/>
+                      <a:ext cx="4359474" cy="3601689"/>
+                    </a:xfrm>
+                    <a:prstGeom prst="rect">
+                      <a:avLst/>
+                    </a:prstGeom>
+                  </pic:spPr>
+                </pic:pic>
+              </a:graphicData>
+            </a:graphic>
+          </wp:inline>
+        </w:drawing>
+      </w:r>
+    </w:p>
+    <w:p>
+      <w:pPr>
+        <w:rPr>
+          <w:b/>
+          <w:bCs/>
+          <w:sz w:val="21"/>
+          <w:szCs w:val="21"/>
+        </w:rPr>
+      </w:pPr>
+    </w:p>
+    <w:p>
+      <w:pPr>
+        <w:rPr>
+          <w:b/>
+          <w:bCs/>
+          <w:sz w:val="21"/>
+          <w:szCs w:val="21"/>
+        </w:rPr>
+      </w:pPr>
+      <w:r>
+        <w:rPr>
+          <w:b/>
+          <w:bCs/>
+          <w:sz w:val="21"/>
+          <w:szCs w:val="21"/>
+        </w:rPr>
+        <w:t xml:space="preserve">GitHub repo: </w:t>
+      </w:r>
+      <w:hyperlink r:id="rId19" w:history="1">
+        <w:r>
+          <w:rPr>
+            <w:rStyle w:val="Hyperlink"/>
+            <w:b/>
+            <w:bCs/>
+            <w:sz w:val="21"/>
+            <w:szCs w:val="21"/>
+          </w:rPr>
+          <w:t>https://github.com/trey1212/municipal-election-web</w:t>
+        </w:r>
+      </w:hyperlink>
+      <w:r>
+        <w:rPr>
+          <w:b/>
+          <w:bCs/>
+          <w:sz w:val="21"/>
+          <w:szCs w:val="21"/>
+        </w:rPr>
+        <w:t xml:space="preserve"> </w:t>
       </w:r>
     </w:p>
     <w:sectPr>
@@ -1476,6 +2209,29 @@
       <w:spacing w:val="5"/>
     </w:rPr>
   </w:style>
+  <w:style w:type="character" w:styleId="Hyperlink">
+    <w:name w:val="Hyperlink"/>
+    <w:basedOn w:val="DefaultParagraphFont"/>
+    <w:uiPriority w:val="99"/>
+    <w:unhideWhenUsed/>
+    <w:rsid w:val="00DA3C3F"/>
+    <w:rPr>
+      <w:color w:val="467886" w:themeColor="hyperlink"/>
+      <w:u w:val="single"/>
+    </w:rPr>
+  </w:style>
+  <w:style w:type="character" w:styleId="UnresolvedMention">
+    <w:name w:val="Unresolved Mention"/>
+    <w:basedOn w:val="DefaultParagraphFont"/>
+    <w:uiPriority w:val="99"/>
+    <w:semiHidden/>
+    <w:unhideWhenUsed/>
+    <w:rsid w:val="00DA3C3F"/>
+    <w:rPr>
+      <w:color w:val="605E5C"/>
+      <w:shd w:val="clear" w:color="auto" w:fill="E1DFDD"/>
+    </w:rPr>
+  </w:style>
 </w:styles>
 </file>
 

</xml_diff>